<commit_message>
feat: model can now read images from student answers
</commit_message>
<xml_diff>
--- a/test/go-endpoint-testing/files/test-answer-devops-image.docx
+++ b/test/go-endpoint-testing/files/test-answer-devops-image.docx
@@ -433,6 +433,23 @@
           <w:bCs/>
         </w:rPr>
       </w:pPr>
+      <w:r>
+        <w:rPr>
+          <w:b/>
+          <w:bCs/>
+        </w:rPr>
+        <w:t>Source:</w:t>
+      </w:r>
+    </w:p>
+    <w:p>
+      <w:hyperlink r:id="rId9" w:history="1">
+        <w:r>
+          <w:rPr>
+            <w:rStyle w:val="Hyperlink"/>
+          </w:rPr>
+          <w:t>https://stbm7resourcesprod.blob.core.windows.net:443/resources/general_course_outline/course_outline/main_material/OS1/018309/20200807105348_Create%20Part.pptx</w:t>
+        </w:r>
+      </w:hyperlink>
     </w:p>
     <w:sectPr>
       <w:pgSz w:w="12240" w:h="15840"/>
@@ -1204,7 +1221,6 @@
   <w:style w:type="character" w:default="1" w:styleId="DefaultParagraphFont">
     <w:name w:val="Default Paragraph Font"/>
     <w:uiPriority w:val="1"/>
-    <w:semiHidden/>
     <w:unhideWhenUsed/>
   </w:style>
   <w:style w:type="table" w:default="1" w:styleId="TableNormal">
@@ -1516,6 +1532,29 @@
       <w:smallCaps/>
       <w:color w:val="0F4761" w:themeColor="accent1" w:themeShade="BF"/>
       <w:spacing w:val="5"/>
+    </w:rPr>
+  </w:style>
+  <w:style w:type="character" w:styleId="Hyperlink">
+    <w:name w:val="Hyperlink"/>
+    <w:basedOn w:val="DefaultParagraphFont"/>
+    <w:uiPriority w:val="99"/>
+    <w:unhideWhenUsed/>
+    <w:rsid w:val="009F3CB0"/>
+    <w:rPr>
+      <w:color w:val="467886" w:themeColor="hyperlink"/>
+      <w:u w:val="single"/>
+    </w:rPr>
+  </w:style>
+  <w:style w:type="character" w:styleId="UnresolvedMention">
+    <w:name w:val="Unresolved Mention"/>
+    <w:basedOn w:val="DefaultParagraphFont"/>
+    <w:uiPriority w:val="99"/>
+    <w:semiHidden/>
+    <w:unhideWhenUsed/>
+    <w:rsid w:val="009F3CB0"/>
+    <w:rPr>
+      <w:color w:val="605E5C"/>
+      <w:shd w:val="clear" w:color="auto" w:fill="E1DFDD"/>
     </w:rPr>
   </w:style>
 </w:styles>

</xml_diff>

<commit_message>
fix: for student answer, all images can be extracted
</commit_message>
<xml_diff>
--- a/test/go-endpoint-testing/files/test-answer-devops-image.docx
+++ b/test/go-endpoint-testing/files/test-answer-devops-image.docx
@@ -4,13 +4,8 @@
   <w:body>
     <w:p>
       <w:r>
-        <w:t xml:space="preserve">Name: </w:t>
-      </w:r>
-      <w:proofErr w:type="spellStart"/>
-      <w:r>
-        <w:t>V.Jon</w:t>
-      </w:r>
-      <w:proofErr w:type="spellEnd"/>
+        <w:t>Name: V.Jon</w:t>
+      </w:r>
     </w:p>
     <w:p>
       <w:pPr>
@@ -147,23 +142,7 @@
           <w:b/>
           <w:bCs/>
         </w:rPr>
-        <w:t xml:space="preserve">DevOps </w:t>
-      </w:r>
-      <w:proofErr w:type="spellStart"/>
-      <w:r>
-        <w:rPr>
-          <w:b/>
-          <w:bCs/>
-        </w:rPr>
-        <w:t>LifeCycle</w:t>
-      </w:r>
-      <w:proofErr w:type="spellEnd"/>
-      <w:r>
-        <w:rPr>
-          <w:b/>
-          <w:bCs/>
-        </w:rPr>
-        <w:t>:</w:t>
+        <w:t>DevOps LifeCycle:</w:t>
       </w:r>
     </w:p>
     <w:p>
@@ -239,23 +218,7 @@
           <w:b/>
           <w:bCs/>
         </w:rPr>
-        <w:t xml:space="preserve">Common </w:t>
-      </w:r>
-      <w:proofErr w:type="spellStart"/>
-      <w:r>
-        <w:rPr>
-          <w:b/>
-          <w:bCs/>
-        </w:rPr>
-        <w:t>Devops</w:t>
-      </w:r>
-      <w:proofErr w:type="spellEnd"/>
-      <w:r>
-        <w:rPr>
-          <w:b/>
-          <w:bCs/>
-        </w:rPr>
-        <w:t xml:space="preserve"> Tools:</w:t>
+        <w:t>Common Devops Tools:</w:t>
       </w:r>
     </w:p>
     <w:p>
@@ -425,6 +388,112 @@
           </wp:inline>
         </w:drawing>
       </w:r>
+      <w:r>
+        <w:rPr>
+          <w:noProof/>
+        </w:rPr>
+        <w:drawing>
+          <wp:inline distT="0" distB="0" distL="0" distR="0" wp14:anchorId="77255F14" wp14:editId="242A7C31">
+            <wp:extent cx="2231409" cy="2231409"/>
+            <wp:effectExtent l="0" t="0" r="0" b="0"/>
+            <wp:docPr id="1669481731" name="Picture 2" descr="Docker original logo - free Icon PNG, SVG"/>
+            <wp:cNvGraphicFramePr>
+              <a:graphicFrameLocks xmlns:a="http://schemas.openxmlformats.org/drawingml/2006/main" noChangeAspect="1"/>
+            </wp:cNvGraphicFramePr>
+            <a:graphic xmlns:a="http://schemas.openxmlformats.org/drawingml/2006/main">
+              <a:graphicData uri="http://schemas.openxmlformats.org/drawingml/2006/picture">
+                <pic:pic xmlns:pic="http://schemas.openxmlformats.org/drawingml/2006/picture">
+                  <pic:nvPicPr>
+                    <pic:cNvPr id="0" name="Picture 6" descr="Docker original logo - free Icon PNG, SVG"/>
+                    <pic:cNvPicPr>
+                      <a:picLocks noChangeAspect="1" noChangeArrowheads="1"/>
+                    </pic:cNvPicPr>
+                  </pic:nvPicPr>
+                  <pic:blipFill>
+                    <a:blip r:embed="rId9">
+                      <a:extLst>
+                        <a:ext uri="{28A0092B-C50C-407E-A947-70E740481C1C}">
+                          <a14:useLocalDpi xmlns:a14="http://schemas.microsoft.com/office/drawing/2010/main" val="0"/>
+                        </a:ext>
+                      </a:extLst>
+                    </a:blip>
+                    <a:srcRect/>
+                    <a:stretch>
+                      <a:fillRect/>
+                    </a:stretch>
+                  </pic:blipFill>
+                  <pic:spPr bwMode="auto">
+                    <a:xfrm>
+                      <a:off x="0" y="0"/>
+                      <a:ext cx="2235271" cy="2235271"/>
+                    </a:xfrm>
+                    <a:prstGeom prst="rect">
+                      <a:avLst/>
+                    </a:prstGeom>
+                    <a:noFill/>
+                    <a:ln>
+                      <a:noFill/>
+                    </a:ln>
+                  </pic:spPr>
+                </pic:pic>
+              </a:graphicData>
+            </a:graphic>
+          </wp:inline>
+        </w:drawing>
+      </w:r>
+      <w:r>
+        <w:rPr>
+          <w:noProof/>
+        </w:rPr>
+        <w:drawing>
+          <wp:inline distT="0" distB="0" distL="0" distR="0" wp14:anchorId="04879DD2" wp14:editId="75BC8B6C">
+            <wp:extent cx="1596788" cy="1552092"/>
+            <wp:effectExtent l="0" t="0" r="3810" b="0"/>
+            <wp:docPr id="1631102303" name="Picture 3"/>
+            <wp:cNvGraphicFramePr>
+              <a:graphicFrameLocks xmlns:a="http://schemas.openxmlformats.org/drawingml/2006/main" noChangeAspect="1"/>
+            </wp:cNvGraphicFramePr>
+            <a:graphic xmlns:a="http://schemas.openxmlformats.org/drawingml/2006/main">
+              <a:graphicData uri="http://schemas.openxmlformats.org/drawingml/2006/picture">
+                <pic:pic xmlns:pic="http://schemas.openxmlformats.org/drawingml/2006/picture">
+                  <pic:nvPicPr>
+                    <pic:cNvPr id="0" name="Picture 8"/>
+                    <pic:cNvPicPr>
+                      <a:picLocks noChangeAspect="1" noChangeArrowheads="1"/>
+                    </pic:cNvPicPr>
+                  </pic:nvPicPr>
+                  <pic:blipFill>
+                    <a:blip r:embed="rId10" cstate="print">
+                      <a:extLst>
+                        <a:ext uri="{28A0092B-C50C-407E-A947-70E740481C1C}">
+                          <a14:useLocalDpi xmlns:a14="http://schemas.microsoft.com/office/drawing/2010/main" val="0"/>
+                        </a:ext>
+                      </a:extLst>
+                    </a:blip>
+                    <a:srcRect/>
+                    <a:stretch>
+                      <a:fillRect/>
+                    </a:stretch>
+                  </pic:blipFill>
+                  <pic:spPr bwMode="auto">
+                    <a:xfrm>
+                      <a:off x="0" y="0"/>
+                      <a:ext cx="1600676" cy="1555871"/>
+                    </a:xfrm>
+                    <a:prstGeom prst="rect">
+                      <a:avLst/>
+                    </a:prstGeom>
+                    <a:noFill/>
+                    <a:ln>
+                      <a:noFill/>
+                    </a:ln>
+                  </pic:spPr>
+                </pic:pic>
+              </a:graphicData>
+            </a:graphic>
+          </wp:inline>
+        </w:drawing>
+      </w:r>
     </w:p>
     <w:p>
       <w:pPr>
@@ -442,7 +511,7 @@
       </w:r>
     </w:p>
     <w:p>
-      <w:hyperlink r:id="rId9" w:history="1">
+      <w:hyperlink r:id="rId11" w:history="1">
         <w:r>
           <w:rPr>
             <w:rStyle w:val="Hyperlink"/>
@@ -1221,6 +1290,7 @@
   <w:style w:type="character" w:default="1" w:styleId="DefaultParagraphFont">
     <w:name w:val="Default Paragraph Font"/>
     <w:uiPriority w:val="1"/>
+    <w:semiHidden/>
     <w:unhideWhenUsed/>
   </w:style>
   <w:style w:type="table" w:default="1" w:styleId="TableNormal">

</xml_diff>